<commit_message>
docs: update web development contract
</commit_message>
<xml_diff>
--- a/docs/contracts/Hop_dong_phat_trien_ung_dung_Thong_tin_kinh_doanh_Web_GD1_TLB_NOV_RECO.docx
+++ b/docs/contracts/Hop_dong_phat_trien_ung_dung_Thong_tin_kinh_doanh_Web_GD1_TLB_NOV_RECO.docx
@@ -2,6 +2,85 @@
 <file path=word/document.xml><?xml version="1.0" encoding="utf-8"?>
 <w:document xmlns:wpc="http://schemas.microsoft.com/office/word/2010/wordprocessingCanvas" xmlns:cx="http://schemas.microsoft.com/office/drawing/2014/chartex" xmlns:cx1="http://schemas.microsoft.com/office/drawing/2015/9/8/chartex" xmlns:cx2="http://schemas.microsoft.com/office/drawing/2015/10/21/chartex" xmlns:cx3="http://schemas.microsoft.com/office/drawing/2016/5/9/chartex" xmlns:cx4="http://schemas.microsoft.com/office/drawing/2016/5/10/chartex" xmlns:cx5="http://schemas.microsoft.com/office/drawing/2016/5/11/chartex" xmlns:cx6="http://schemas.microsoft.com/office/drawing/2016/5/12/chartex" xmlns:cx7="http://schemas.microsoft.com/office/drawing/2016/5/13/chartex" xmlns:cx8="http://schemas.microsoft.com/office/drawing/2016/5/14/chartex" xmlns:mc="http://schemas.openxmlformats.org/markup-compatibility/2006" xmlns:aink="http://schemas.microsoft.com/office/drawing/2016/ink" xmlns:am3d="http://schemas.microsoft.com/office/drawing/2017/model3d" xmlns:o="urn:schemas-microsoft-com:office:office" xmlns:oel="http://schemas.microsoft.com/office/2019/extlst" xmlns:r="http://schemas.openxmlformats.org/officeDocument/2006/relationships" xmlns:m="http://schemas.openxmlformats.org/officeDocument/2006/math" xmlns:v="urn:schemas-microsoft-com:vml" xmlns:wp14="http://schemas.microsoft.com/office/word/2010/wordprocessingDrawing" xmlns:wp="http://schemas.openxmlformats.org/drawingml/2006/wordprocessingDrawing" xmlns:w10="urn:schemas-microsoft-com:office:word" xmlns:w="http://schemas.openxmlformats.org/wordprocessingml/2006/main" xmlns:w14="http://schemas.microsoft.com/office/word/2010/wordml" xmlns:w15="http://schemas.microsoft.com/office/word/2012/wordml" xmlns:w16cex="http://schemas.microsoft.com/office/word/2018/wordml/cex" xmlns:w16cid="http://schemas.microsoft.com/office/word/2016/wordml/cid" xmlns:w16="http://schemas.microsoft.com/office/word/2018/wordml" xmlns:w16du="http://schemas.microsoft.com/office/word/2023/wordml/word16du" xmlns:w16sdtdh="http://schemas.microsoft.com/office/word/2020/wordml/sdtdatahash" xmlns:w16sdtfl="http://schemas.microsoft.com/office/word/2024/wordml/sdtformatlock" xmlns:w16se="http://schemas.microsoft.com/office/word/2015/wordml/symex" xmlns:wpg="http://schemas.microsoft.com/office/word/2010/wordprocessingGroup" xmlns:wpi="http://schemas.microsoft.com/office/word/2010/wordprocessingInk" xmlns:wne="http://schemas.microsoft.com/office/word/2006/wordml" xmlns:wps="http://schemas.microsoft.com/office/word/2010/wordprocessingShape" mc:Ignorable="w14 w15 w16se w16cid w16 w16cex w16sdtdh w16sdtfl w16du wp14">
   <w:body>
+    <w:tbl>
+      <w:tblPr>
+        <w:tblW w:w="0" w:type="auto"/>
+        <w:tblLayout w:type="fixed"/>
+        <w:tblLook w:val="04A0" w:firstRow="1" w:lastRow="0" w:firstColumn="1" w:lastColumn="0" w:noHBand="0" w:noVBand="1"/>
+      </w:tblPr>
+      <w:tblGrid>
+        <w:gridCol w:w="4620"/>
+        <w:gridCol w:w="4620"/>
+      </w:tblGrid>
+      <w:tr>
+        <w:tc>
+          <w:tcPr>
+            <w:tcW w:w="4620" w:type="dxa"/>
+          </w:tcPr>
+          <w:p>
+            <w:pPr>
+              <w:jc w:val="center"/>
+            </w:pPr>
+            <w:r>
+              <w:rPr>
+                <w:b/>
+                <w:sz w:val="20"/>
+              </w:rPr>
+              <w:t>CÔNG TY TNHH DỊCH VỤ GIẢI TRÍ TLB</w:t>
+            </w:r>
+          </w:p>
+        </w:tc>
+        <w:tc>
+          <w:tcPr>
+            <w:tcW w:w="4620" w:type="dxa"/>
+          </w:tcPr>
+          <w:p>
+            <w:pPr>
+              <w:jc w:val="center"/>
+            </w:pPr>
+            <w:r>
+              <w:rPr>
+                <w:b/>
+                <w:sz w:val="20"/>
+              </w:rPr>
+              <w:t>CỘNG HÒA XÃ HỘI CHỦ NGHĨA VIỆT NAM</w:t>
+            </w:r>
+            <w:r>
+              <w:rPr>
+                <w:b/>
+                <w:sz w:val="20"/>
+              </w:rPr>
+              <w:br/>
+              <w:t>Độc lập - Tự do - Hạnh phúc</w:t>
+            </w:r>
+          </w:p>
+        </w:tc>
+      </w:tr>
+    </w:tbl>
+    <w:p>
+      <w:pPr>
+        <w:pStyle w:val="Title"/>
+        <w:spacing w:before="0"/>
+        <w:jc w:val="center"/>
+        <w:rPr>
+          <w:rFonts w:ascii="Times New Roman" w:hAnsi="Times New Roman" w:cs="Times New Roman"/>
+          <w:b w:val="0"/>
+          <w:bCs/>
+          <w:sz w:val="24"/>
+          <w:szCs w:val="44"/>
+        </w:rPr>
+      </w:pPr>
+      <w:r>
+        <w:rPr>
+          <w:rFonts w:ascii="Times New Roman" w:hAnsi="Times New Roman" w:cs="Times New Roman"/>
+          <w:b w:val="0"/>
+          <w:bCs/>
+          <w:sz w:val="24"/>
+          <w:szCs w:val="44"/>
+        </w:rPr>
+        <w:t>-------------------------------------</w:t>
+      </w:r>
+    </w:p>
     <w:p>
       <w:pPr>
         <w:pStyle w:val="Title"/>
@@ -1767,8 +1846,14 @@
         <w:rPr>
           <w:rFonts w:cs="Times New Roman"/>
         </w:rPr>
+        <w:t xml:space="preserve">4.4. Bên A bảo hành sản phẩm trong 02 tháng kể từ ngày ký biên bản nghiệm thu đối với lỗi phần mềm làm chức năng hoạt động sai so với Phụ lục 01. Bảo hành không bao gồm tính năng mới, thay đổi nghiệp </w:t>
+      </w:r>
+      <w:r>
+        <w:rPr>
+          <w:rFonts w:cs="Times New Roman"/>
+        </w:rPr>
         <w:lastRenderedPageBreak/>
-        <w:t>4.4. Bên A bảo hành sản phẩm trong 02 tháng kể từ ngày ký biên bản nghiệm thu đối với lỗi phần mềm làm chức năng hoạt động sai so với Phụ lục 01. Bảo hành không bao gồm tính năng mới, thay đổi nghiệp vụ/giao diện, nhập liệu, lỗi dữ liệu, hạ tầng hoặc dịch vụ bên thứ ba, và lỗi do Bên B hoặc bên thứ ba can thiệp. Các nội dung này được xử lý theo cơ chế phát sinh tại Điều 4.5.</w:t>
+        <w:t>vụ/giao diện, nhập liệu, lỗi dữ liệu, hạ tầng hoặc dịch vụ bên thứ ba, và lỗi do Bên B hoặc bên thứ ba can thiệp. Các nội dung này được xử lý theo cơ chế phát sinh tại Điều 4.5.</w:t>
       </w:r>
     </w:p>
     <w:p>
@@ -2070,7 +2155,6 @@
         <w:rPr>
           <w:rFonts w:ascii="Times New Roman" w:hAnsi="Times New Roman" w:cs="Times New Roman"/>
         </w:rPr>
-        <w:lastRenderedPageBreak/>
         <w:t>ĐIỀU 8. VI PHẠM, CHẤM DỨT VÀ TRÁCH NHIỆM</w:t>
       </w:r>
     </w:p>
@@ -2113,6 +2197,7 @@
         <w:rPr>
           <w:rFonts w:cs="Times New Roman"/>
         </w:rPr>
+        <w:lastRenderedPageBreak/>
         <w:t>8.3. Khi chấm dứt trước hạn, Bên B thanh toán phần công việc đã hoàn thành và chi phí hợp lý đã phát sinh; Bên A bàn giao phần kết quả tương ứng với khoản đã thanh toán.</w:t>
       </w:r>
     </w:p>
@@ -2540,14 +2625,7 @@
       </w:pPr>
       <w:r>
         <w:rPr>
-          <w:rFonts w:ascii="Times New Roman" w:hAnsi="Times New Roman" w:cs="Times New Roman"/>
-        </w:rPr>
-      </w:r>
-      <w:r>
-        <w:rPr>
-          <w:rFonts w:ascii="Arial" w:hAnsi="Arial" w:eastAsia="Arial"/>
-          <w:b/>
-          <w:sz w:val="24"/>
+          <w:rFonts w:ascii="Arial" w:eastAsia="Arial" w:hAnsi="Arial"/>
         </w:rPr>
         <w:t>2. DANH MỤC CHỨC NĂNG GIAI ĐOẠN 1</w:t>
       </w:r>
@@ -2556,16 +2634,16 @@
       <w:tblPr>
         <w:tblW w:w="0" w:type="auto"/>
         <w:jc w:val="center"/>
+        <w:tblBorders>
+          <w:top w:val="single" w:sz="4" w:space="0" w:color="D9D9D9"/>
+          <w:left w:val="single" w:sz="4" w:space="0" w:color="D9D9D9"/>
+          <w:bottom w:val="single" w:sz="4" w:space="0" w:color="D9D9D9"/>
+          <w:right w:val="single" w:sz="4" w:space="0" w:color="D9D9D9"/>
+          <w:insideH w:val="single" w:sz="4" w:space="0" w:color="D9D9D9"/>
+          <w:insideV w:val="single" w:sz="4" w:space="0" w:color="D9D9D9"/>
+        </w:tblBorders>
         <w:tblLayout w:type="fixed"/>
         <w:tblLook w:val="04A0" w:firstRow="1" w:lastRow="0" w:firstColumn="1" w:lastColumn="0" w:noHBand="0" w:noVBand="1"/>
-        <w:tblBorders>
-          <w:top w:val="single" w:sz="4" w:color="D9D9D9"/>
-          <w:left w:val="single" w:sz="4" w:color="D9D9D9"/>
-          <w:bottom w:val="single" w:sz="4" w:color="D9D9D9"/>
-          <w:right w:val="single" w:sz="4" w:color="D9D9D9"/>
-          <w:insideH w:val="single" w:sz="4" w:color="D9D9D9"/>
-          <w:insideV w:val="single" w:sz="4" w:color="D9D9D9"/>
-        </w:tblBorders>
       </w:tblPr>
       <w:tblGrid>
         <w:gridCol w:w="624"/>
@@ -2577,7 +2655,6 @@
           <w:cantSplit/>
           <w:tblHeader/>
           <w:jc w:val="center"/>
-          <w:tblHeader w:val="true"/>
         </w:trPr>
         <w:tc>
           <w:tcPr>
@@ -2585,23 +2662,19 @@
             <w:shd w:val="clear" w:color="auto" w:fill="D9EAF7"/>
             <w:tcMar>
               <w:top w:w="90" w:type="dxa"/>
-              <w:left w:w="80" w:type="dxa"/>
+              <w:left w:w="110" w:type="dxa"/>
               <w:bottom w:w="90" w:type="dxa"/>
-              <w:right w:w="80" w:type="dxa"/>
-              <w:start w:w="110" w:type="dxa"/>
-              <w:end w:w="110" w:type="dxa"/>
+              <w:right w:w="110" w:type="dxa"/>
             </w:tcMar>
             <w:vAlign w:val="center"/>
           </w:tcPr>
           <w:p>
             <w:pPr>
-              <w:spacing w:before="0" w:after="0" w:line="252" w:lineRule="auto"/>
+              <w:spacing w:after="0" w:line="252" w:lineRule="auto"/>
               <w:jc w:val="center"/>
             </w:pPr>
-            <w:r/>
             <w:r>
               <w:rPr>
-                <w:rFonts w:ascii="Times New Roman" w:hAnsi="Times New Roman" w:eastAsia="Times New Roman"/>
                 <w:b/>
                 <w:sz w:val="18"/>
               </w:rPr>
@@ -2615,23 +2688,19 @@
             <w:shd w:val="clear" w:color="auto" w:fill="D9EAF7"/>
             <w:tcMar>
               <w:top w:w="90" w:type="dxa"/>
-              <w:left w:w="80" w:type="dxa"/>
+              <w:left w:w="110" w:type="dxa"/>
               <w:bottom w:w="90" w:type="dxa"/>
-              <w:right w:w="80" w:type="dxa"/>
-              <w:start w:w="110" w:type="dxa"/>
-              <w:end w:w="110" w:type="dxa"/>
+              <w:right w:w="110" w:type="dxa"/>
             </w:tcMar>
             <w:vAlign w:val="center"/>
           </w:tcPr>
           <w:p>
             <w:pPr>
-              <w:spacing w:before="0" w:after="0" w:line="252" w:lineRule="auto"/>
+              <w:spacing w:after="0" w:line="252" w:lineRule="auto"/>
               <w:jc w:val="center"/>
             </w:pPr>
-            <w:r/>
             <w:r>
               <w:rPr>
-                <w:rFonts w:ascii="Times New Roman" w:hAnsi="Times New Roman" w:eastAsia="Times New Roman"/>
                 <w:b/>
                 <w:sz w:val="18"/>
               </w:rPr>
@@ -2645,23 +2714,19 @@
             <w:shd w:val="clear" w:color="auto" w:fill="D9EAF7"/>
             <w:tcMar>
               <w:top w:w="90" w:type="dxa"/>
-              <w:left w:w="80" w:type="dxa"/>
+              <w:left w:w="110" w:type="dxa"/>
               <w:bottom w:w="90" w:type="dxa"/>
-              <w:right w:w="80" w:type="dxa"/>
-              <w:start w:w="110" w:type="dxa"/>
-              <w:end w:w="110" w:type="dxa"/>
+              <w:right w:w="110" w:type="dxa"/>
             </w:tcMar>
             <w:vAlign w:val="center"/>
           </w:tcPr>
           <w:p>
             <w:pPr>
-              <w:spacing w:before="0" w:after="0" w:line="252" w:lineRule="auto"/>
+              <w:spacing w:after="0" w:line="252" w:lineRule="auto"/>
               <w:jc w:val="center"/>
             </w:pPr>
-            <w:r/>
             <w:r>
               <w:rPr>
-                <w:rFonts w:ascii="Times New Roman" w:hAnsi="Times New Roman" w:eastAsia="Times New Roman"/>
                 <w:b/>
                 <w:sz w:val="18"/>
               </w:rPr>
@@ -2673,28 +2738,26 @@
       <w:tr>
         <w:trPr>
           <w:cantSplit/>
+          <w:jc w:val="center"/>
         </w:trPr>
         <w:tc>
           <w:tcPr>
-            <w:tcW w:type="dxa" w:w="624"/>
-            <w:vAlign w:val="center"/>
+            <w:tcW w:w="624" w:type="dxa"/>
             <w:tcMar>
               <w:top w:w="90" w:type="dxa"/>
-              <w:start w:w="110" w:type="dxa"/>
+              <w:left w:w="110" w:type="dxa"/>
               <w:bottom w:w="90" w:type="dxa"/>
-              <w:end w:w="110" w:type="dxa"/>
+              <w:right w:w="110" w:type="dxa"/>
             </w:tcMar>
+            <w:vAlign w:val="center"/>
           </w:tcPr>
           <w:p>
             <w:pPr>
-              <w:spacing w:before="0" w:after="0" w:line="252" w:lineRule="auto"/>
+              <w:spacing w:after="0" w:line="252" w:lineRule="auto"/>
               <w:jc w:val="center"/>
             </w:pPr>
-            <w:r/>
             <w:r>
               <w:rPr>
-                <w:rFonts w:ascii="Times New Roman" w:hAnsi="Times New Roman" w:eastAsia="Times New Roman"/>
-                <w:b w:val="0"/>
                 <w:sz w:val="18"/>
               </w:rPr>
               <w:t>1</w:t>
@@ -2703,24 +2766,21 @@
         </w:tc>
         <w:tc>
           <w:tcPr>
-            <w:tcW w:type="dxa" w:w="2494"/>
-            <w:vAlign w:val="center"/>
+            <w:tcW w:w="2494" w:type="dxa"/>
             <w:tcMar>
               <w:top w:w="90" w:type="dxa"/>
-              <w:start w:w="110" w:type="dxa"/>
+              <w:left w:w="110" w:type="dxa"/>
               <w:bottom w:w="90" w:type="dxa"/>
-              <w:end w:w="110" w:type="dxa"/>
+              <w:right w:w="110" w:type="dxa"/>
             </w:tcMar>
+            <w:vAlign w:val="center"/>
           </w:tcPr>
           <w:p>
             <w:pPr>
-              <w:spacing w:before="0" w:after="0" w:line="252" w:lineRule="auto"/>
-              <w:jc w:val="left"/>
+              <w:spacing w:after="0" w:line="252" w:lineRule="auto"/>
             </w:pPr>
-            <w:r/>
             <w:r>
               <w:rPr>
-                <w:rFonts w:ascii="Times New Roman" w:hAnsi="Times New Roman" w:eastAsia="Times New Roman"/>
                 <w:b/>
                 <w:sz w:val="18"/>
               </w:rPr>
@@ -2730,25 +2790,21 @@
         </w:tc>
         <w:tc>
           <w:tcPr>
-            <w:tcW w:type="dxa" w:w="6406"/>
-            <w:vAlign w:val="center"/>
+            <w:tcW w:w="6406" w:type="dxa"/>
             <w:tcMar>
               <w:top w:w="90" w:type="dxa"/>
-              <w:start w:w="110" w:type="dxa"/>
+              <w:left w:w="110" w:type="dxa"/>
               <w:bottom w:w="90" w:type="dxa"/>
-              <w:end w:w="110" w:type="dxa"/>
+              <w:right w:w="110" w:type="dxa"/>
             </w:tcMar>
+            <w:vAlign w:val="center"/>
           </w:tcPr>
           <w:p>
             <w:pPr>
-              <w:spacing w:before="0" w:after="0" w:line="252" w:lineRule="auto"/>
-              <w:jc w:val="left"/>
+              <w:spacing w:after="0" w:line="252" w:lineRule="auto"/>
             </w:pPr>
-            <w:r/>
             <w:r>
               <w:rPr>
-                <w:rFonts w:ascii="Times New Roman" w:hAnsi="Times New Roman" w:eastAsia="Times New Roman"/>
-                <w:b w:val="0"/>
                 <w:sz w:val="18"/>
               </w:rPr>
               <w:t>Phiên bản Web responsive dùng trên máy tính và thiết bị di động; kho mã nguồn, cấu hình môi trường phát triển, kiểm thử và chạy thật; quy trình triển khai, kiểm tra tự động và hướng lỗi; hướng dẫn sao lưu. Chi phí máy chủ, tên miền, lưu trữ và dịch vụ bên thứ ba không thuộc Hợp đồng.</w:t>
@@ -2759,28 +2815,26 @@
       <w:tr>
         <w:trPr>
           <w:cantSplit/>
+          <w:jc w:val="center"/>
         </w:trPr>
         <w:tc>
           <w:tcPr>
-            <w:tcW w:type="dxa" w:w="624"/>
-            <w:vAlign w:val="center"/>
+            <w:tcW w:w="624" w:type="dxa"/>
             <w:tcMar>
               <w:top w:w="90" w:type="dxa"/>
-              <w:start w:w="110" w:type="dxa"/>
+              <w:left w:w="110" w:type="dxa"/>
               <w:bottom w:w="90" w:type="dxa"/>
-              <w:end w:w="110" w:type="dxa"/>
+              <w:right w:w="110" w:type="dxa"/>
             </w:tcMar>
+            <w:vAlign w:val="center"/>
           </w:tcPr>
           <w:p>
             <w:pPr>
-              <w:spacing w:before="0" w:after="0" w:line="252" w:lineRule="auto"/>
+              <w:spacing w:after="0" w:line="252" w:lineRule="auto"/>
               <w:jc w:val="center"/>
             </w:pPr>
-            <w:r/>
             <w:r>
               <w:rPr>
-                <w:rFonts w:ascii="Times New Roman" w:hAnsi="Times New Roman" w:eastAsia="Times New Roman"/>
-                <w:b w:val="0"/>
                 <w:sz w:val="18"/>
               </w:rPr>
               <w:t>2</w:t>
@@ -2789,24 +2843,21 @@
         </w:tc>
         <w:tc>
           <w:tcPr>
-            <w:tcW w:type="dxa" w:w="2494"/>
-            <w:vAlign w:val="center"/>
+            <w:tcW w:w="2494" w:type="dxa"/>
             <w:tcMar>
               <w:top w:w="90" w:type="dxa"/>
-              <w:start w:w="110" w:type="dxa"/>
+              <w:left w:w="110" w:type="dxa"/>
               <w:bottom w:w="90" w:type="dxa"/>
-              <w:end w:w="110" w:type="dxa"/>
+              <w:right w:w="110" w:type="dxa"/>
             </w:tcMar>
+            <w:vAlign w:val="center"/>
           </w:tcPr>
           <w:p>
             <w:pPr>
-              <w:spacing w:before="0" w:after="0" w:line="252" w:lineRule="auto"/>
-              <w:jc w:val="left"/>
+              <w:spacing w:after="0" w:line="252" w:lineRule="auto"/>
             </w:pPr>
-            <w:r/>
             <w:r>
               <w:rPr>
-                <w:rFonts w:ascii="Times New Roman" w:hAnsi="Times New Roman" w:eastAsia="Times New Roman"/>
                 <w:b/>
                 <w:sz w:val="18"/>
               </w:rPr>
@@ -2816,25 +2867,21 @@
         </w:tc>
         <w:tc>
           <w:tcPr>
-            <w:tcW w:type="dxa" w:w="6406"/>
-            <w:vAlign w:val="center"/>
+            <w:tcW w:w="6406" w:type="dxa"/>
             <w:tcMar>
               <w:top w:w="90" w:type="dxa"/>
-              <w:start w:w="110" w:type="dxa"/>
+              <w:left w:w="110" w:type="dxa"/>
               <w:bottom w:w="90" w:type="dxa"/>
-              <w:end w:w="110" w:type="dxa"/>
+              <w:right w:w="110" w:type="dxa"/>
             </w:tcMar>
+            <w:vAlign w:val="center"/>
           </w:tcPr>
           <w:p>
             <w:pPr>
-              <w:spacing w:before="0" w:after="0" w:line="252" w:lineRule="auto"/>
-              <w:jc w:val="left"/>
+              <w:spacing w:after="0" w:line="252" w:lineRule="auto"/>
             </w:pPr>
-            <w:r/>
             <w:r>
               <w:rPr>
-                <w:rFonts w:ascii="Times New Roman" w:hAnsi="Times New Roman" w:eastAsia="Times New Roman"/>
-                <w:b w:val="0"/>
                 <w:sz w:val="18"/>
               </w:rPr>
               <w:t>Khung giao diện thống nhất, menu theo quyền, các trạng thái tải dữ liệu, trống và báo lỗi; hiển thị thích ứng; điều hướng giữa Trang đầu, Dự án, Sản phẩm, Tài liệu, Bài đăng, Quản trị và Người dùng.</w:t>
@@ -2845,28 +2892,26 @@
       <w:tr>
         <w:trPr>
           <w:cantSplit/>
+          <w:jc w:val="center"/>
         </w:trPr>
         <w:tc>
           <w:tcPr>
-            <w:tcW w:type="dxa" w:w="624"/>
-            <w:vAlign w:val="center"/>
+            <w:tcW w:w="624" w:type="dxa"/>
             <w:tcMar>
               <w:top w:w="90" w:type="dxa"/>
-              <w:start w:w="110" w:type="dxa"/>
+              <w:left w:w="110" w:type="dxa"/>
               <w:bottom w:w="90" w:type="dxa"/>
-              <w:end w:w="110" w:type="dxa"/>
+              <w:right w:w="110" w:type="dxa"/>
             </w:tcMar>
+            <w:vAlign w:val="center"/>
           </w:tcPr>
           <w:p>
             <w:pPr>
-              <w:spacing w:before="0" w:after="0" w:line="252" w:lineRule="auto"/>
+              <w:spacing w:after="0" w:line="252" w:lineRule="auto"/>
               <w:jc w:val="center"/>
             </w:pPr>
-            <w:r/>
             <w:r>
               <w:rPr>
-                <w:rFonts w:ascii="Times New Roman" w:hAnsi="Times New Roman" w:eastAsia="Times New Roman"/>
-                <w:b w:val="0"/>
                 <w:sz w:val="18"/>
               </w:rPr>
               <w:t>3</w:t>
@@ -2875,24 +2920,21 @@
         </w:tc>
         <w:tc>
           <w:tcPr>
-            <w:tcW w:type="dxa" w:w="2494"/>
-            <w:vAlign w:val="center"/>
+            <w:tcW w:w="2494" w:type="dxa"/>
             <w:tcMar>
               <w:top w:w="90" w:type="dxa"/>
-              <w:start w:w="110" w:type="dxa"/>
+              <w:left w:w="110" w:type="dxa"/>
               <w:bottom w:w="90" w:type="dxa"/>
-              <w:end w:w="110" w:type="dxa"/>
+              <w:right w:w="110" w:type="dxa"/>
             </w:tcMar>
+            <w:vAlign w:val="center"/>
           </w:tcPr>
           <w:p>
             <w:pPr>
-              <w:spacing w:before="0" w:after="0" w:line="252" w:lineRule="auto"/>
-              <w:jc w:val="left"/>
+              <w:spacing w:after="0" w:line="252" w:lineRule="auto"/>
             </w:pPr>
-            <w:r/>
             <w:r>
               <w:rPr>
-                <w:rFonts w:ascii="Times New Roman" w:hAnsi="Times New Roman" w:eastAsia="Times New Roman"/>
                 <w:b/>
                 <w:sz w:val="18"/>
               </w:rPr>
@@ -2902,25 +2944,21 @@
         </w:tc>
         <w:tc>
           <w:tcPr>
-            <w:tcW w:type="dxa" w:w="6406"/>
-            <w:vAlign w:val="center"/>
+            <w:tcW w:w="6406" w:type="dxa"/>
             <w:tcMar>
               <w:top w:w="90" w:type="dxa"/>
-              <w:start w:w="110" w:type="dxa"/>
+              <w:left w:w="110" w:type="dxa"/>
               <w:bottom w:w="90" w:type="dxa"/>
-              <w:end w:w="110" w:type="dxa"/>
+              <w:right w:w="110" w:type="dxa"/>
             </w:tcMar>
+            <w:vAlign w:val="center"/>
           </w:tcPr>
           <w:p>
             <w:pPr>
-              <w:spacing w:before="0" w:after="0" w:line="252" w:lineRule="auto"/>
-              <w:jc w:val="left"/>
+              <w:spacing w:after="0" w:line="252" w:lineRule="auto"/>
             </w:pPr>
-            <w:r/>
             <w:r>
               <w:rPr>
-                <w:rFonts w:ascii="Times New Roman" w:hAnsi="Times New Roman" w:eastAsia="Times New Roman"/>
-                <w:b w:val="0"/>
                 <w:sz w:val="18"/>
               </w:rPr>
               <w:t>Hiển thị theo người dùng: dự án được giao, dự án nổi bật, dải Sản phẩm Hot, bài đăng dùng chung, việc chờ duyệt và cảnh báo tài liệu hoặc tài khoản cần xử lý. Nội dung không có quyền xem phải được ẩn.</w:t>
@@ -2931,28 +2969,26 @@
       <w:tr>
         <w:trPr>
           <w:cantSplit/>
+          <w:jc w:val="center"/>
         </w:trPr>
         <w:tc>
           <w:tcPr>
-            <w:tcW w:type="dxa" w:w="624"/>
-            <w:vAlign w:val="center"/>
+            <w:tcW w:w="624" w:type="dxa"/>
             <w:tcMar>
               <w:top w:w="90" w:type="dxa"/>
-              <w:start w:w="110" w:type="dxa"/>
+              <w:left w:w="110" w:type="dxa"/>
               <w:bottom w:w="90" w:type="dxa"/>
-              <w:end w:w="110" w:type="dxa"/>
+              <w:right w:w="110" w:type="dxa"/>
             </w:tcMar>
+            <w:vAlign w:val="center"/>
           </w:tcPr>
           <w:p>
             <w:pPr>
-              <w:spacing w:before="0" w:after="0" w:line="252" w:lineRule="auto"/>
+              <w:spacing w:after="0" w:line="252" w:lineRule="auto"/>
               <w:jc w:val="center"/>
             </w:pPr>
-            <w:r/>
             <w:r>
               <w:rPr>
-                <w:rFonts w:ascii="Times New Roman" w:hAnsi="Times New Roman" w:eastAsia="Times New Roman"/>
-                <w:b w:val="0"/>
                 <w:sz w:val="18"/>
               </w:rPr>
               <w:t>4</w:t>
@@ -2961,24 +2997,21 @@
         </w:tc>
         <w:tc>
           <w:tcPr>
-            <w:tcW w:type="dxa" w:w="2494"/>
-            <w:vAlign w:val="center"/>
+            <w:tcW w:w="2494" w:type="dxa"/>
             <w:tcMar>
               <w:top w:w="90" w:type="dxa"/>
-              <w:start w:w="110" w:type="dxa"/>
+              <w:left w:w="110" w:type="dxa"/>
               <w:bottom w:w="90" w:type="dxa"/>
-              <w:end w:w="110" w:type="dxa"/>
+              <w:right w:w="110" w:type="dxa"/>
             </w:tcMar>
+            <w:vAlign w:val="center"/>
           </w:tcPr>
           <w:p>
             <w:pPr>
-              <w:spacing w:before="0" w:after="0" w:line="252" w:lineRule="auto"/>
-              <w:jc w:val="left"/>
+              <w:spacing w:after="0" w:line="252" w:lineRule="auto"/>
             </w:pPr>
-            <w:r/>
             <w:r>
               <w:rPr>
-                <w:rFonts w:ascii="Times New Roman" w:hAnsi="Times New Roman" w:eastAsia="Times New Roman"/>
                 <w:b/>
                 <w:sz w:val="18"/>
               </w:rPr>
@@ -2988,25 +3021,21 @@
         </w:tc>
         <w:tc>
           <w:tcPr>
-            <w:tcW w:type="dxa" w:w="6406"/>
-            <w:vAlign w:val="center"/>
+            <w:tcW w:w="6406" w:type="dxa"/>
             <w:tcMar>
               <w:top w:w="90" w:type="dxa"/>
-              <w:start w:w="110" w:type="dxa"/>
+              <w:left w:w="110" w:type="dxa"/>
               <w:bottom w:w="90" w:type="dxa"/>
-              <w:end w:w="110" w:type="dxa"/>
+              <w:right w:w="110" w:type="dxa"/>
             </w:tcMar>
+            <w:vAlign w:val="center"/>
           </w:tcPr>
           <w:p>
             <w:pPr>
-              <w:spacing w:before="0" w:after="0" w:line="252" w:lineRule="auto"/>
-              <w:jc w:val="left"/>
+              <w:spacing w:after="0" w:line="252" w:lineRule="auto"/>
             </w:pPr>
-            <w:r/>
             <w:r>
               <w:rPr>
-                <w:rFonts w:ascii="Times New Roman" w:hAnsi="Times New Roman" w:eastAsia="Times New Roman"/>
-                <w:b w:val="0"/>
                 <w:sz w:val="18"/>
               </w:rPr>
               <w:t>Đăng nhập bằng số điện thoại hoặc thư điện tử và mật khẩu; đăng xuất, đặt lại mật khẩu và quản lý phiên sử dụng. Không bao gồm mã xác thực một lần (OTP) trong Giai đoạn 1.</w:t>
@@ -3017,28 +3046,26 @@
       <w:tr>
         <w:trPr>
           <w:cantSplit/>
+          <w:jc w:val="center"/>
         </w:trPr>
         <w:tc>
           <w:tcPr>
-            <w:tcW w:type="dxa" w:w="624"/>
-            <w:vAlign w:val="center"/>
+            <w:tcW w:w="624" w:type="dxa"/>
             <w:tcMar>
               <w:top w:w="90" w:type="dxa"/>
-              <w:start w:w="110" w:type="dxa"/>
+              <w:left w:w="110" w:type="dxa"/>
               <w:bottom w:w="90" w:type="dxa"/>
-              <w:end w:w="110" w:type="dxa"/>
+              <w:right w:w="110" w:type="dxa"/>
             </w:tcMar>
+            <w:vAlign w:val="center"/>
           </w:tcPr>
           <w:p>
             <w:pPr>
-              <w:spacing w:before="0" w:after="0" w:line="252" w:lineRule="auto"/>
+              <w:spacing w:after="0" w:line="252" w:lineRule="auto"/>
               <w:jc w:val="center"/>
             </w:pPr>
-            <w:r/>
             <w:r>
               <w:rPr>
-                <w:rFonts w:ascii="Times New Roman" w:hAnsi="Times New Roman" w:eastAsia="Times New Roman"/>
-                <w:b w:val="0"/>
                 <w:sz w:val="18"/>
               </w:rPr>
               <w:t>5</w:t>
@@ -3047,24 +3074,21 @@
         </w:tc>
         <w:tc>
           <w:tcPr>
-            <w:tcW w:type="dxa" w:w="2494"/>
-            <w:vAlign w:val="center"/>
+            <w:tcW w:w="2494" w:type="dxa"/>
             <w:tcMar>
               <w:top w:w="90" w:type="dxa"/>
-              <w:start w:w="110" w:type="dxa"/>
+              <w:left w:w="110" w:type="dxa"/>
               <w:bottom w:w="90" w:type="dxa"/>
-              <w:end w:w="110" w:type="dxa"/>
+              <w:right w:w="110" w:type="dxa"/>
             </w:tcMar>
+            <w:vAlign w:val="center"/>
           </w:tcPr>
           <w:p>
             <w:pPr>
-              <w:spacing w:before="0" w:after="0" w:line="252" w:lineRule="auto"/>
-              <w:jc w:val="left"/>
+              <w:spacing w:after="0" w:line="252" w:lineRule="auto"/>
             </w:pPr>
-            <w:r/>
             <w:r>
               <w:rPr>
-                <w:rFonts w:ascii="Times New Roman" w:hAnsi="Times New Roman" w:eastAsia="Times New Roman"/>
                 <w:b/>
                 <w:sz w:val="18"/>
               </w:rPr>
@@ -3074,25 +3098,21 @@
         </w:tc>
         <w:tc>
           <w:tcPr>
-            <w:tcW w:type="dxa" w:w="6406"/>
-            <w:vAlign w:val="center"/>
+            <w:tcW w:w="6406" w:type="dxa"/>
             <w:tcMar>
               <w:top w:w="90" w:type="dxa"/>
-              <w:start w:w="110" w:type="dxa"/>
+              <w:left w:w="110" w:type="dxa"/>
               <w:bottom w:w="90" w:type="dxa"/>
-              <w:end w:w="110" w:type="dxa"/>
+              <w:right w:w="110" w:type="dxa"/>
             </w:tcMar>
+            <w:vAlign w:val="center"/>
           </w:tcPr>
           <w:p>
             <w:pPr>
-              <w:spacing w:before="0" w:after="0" w:line="252" w:lineRule="auto"/>
-              <w:jc w:val="left"/>
+              <w:spacing w:after="0" w:line="252" w:lineRule="auto"/>
             </w:pPr>
-            <w:r/>
             <w:r>
               <w:rPr>
-                <w:rFonts w:ascii="Times New Roman" w:hAnsi="Times New Roman" w:eastAsia="Times New Roman"/>
-                <w:b w:val="0"/>
                 <w:sz w:val="18"/>
               </w:rPr>
               <w:t>Quản lý tài khoản, trạng thái sử dụng, vai trò và phạm vi dự án được giao; phân quyền xem, tạo, sửa, duyệt và chia sẻ. Nội dung có ba mức Công khai, Nội bộ và Nội bộ hạn chế; quyền của mục cha được kế thừa xuống mục con theo mức chặt hơn.</w:t>
@@ -3103,28 +3123,26 @@
       <w:tr>
         <w:trPr>
           <w:cantSplit/>
+          <w:jc w:val="center"/>
         </w:trPr>
         <w:tc>
           <w:tcPr>
-            <w:tcW w:type="dxa" w:w="624"/>
-            <w:vAlign w:val="center"/>
+            <w:tcW w:w="624" w:type="dxa"/>
             <w:tcMar>
               <w:top w:w="90" w:type="dxa"/>
-              <w:start w:w="110" w:type="dxa"/>
+              <w:left w:w="110" w:type="dxa"/>
               <w:bottom w:w="90" w:type="dxa"/>
-              <w:end w:w="110" w:type="dxa"/>
+              <w:right w:w="110" w:type="dxa"/>
             </w:tcMar>
+            <w:vAlign w:val="center"/>
           </w:tcPr>
           <w:p>
             <w:pPr>
-              <w:spacing w:before="0" w:after="0" w:line="252" w:lineRule="auto"/>
+              <w:spacing w:after="0" w:line="252" w:lineRule="auto"/>
               <w:jc w:val="center"/>
             </w:pPr>
-            <w:r/>
             <w:r>
               <w:rPr>
-                <w:rFonts w:ascii="Times New Roman" w:hAnsi="Times New Roman" w:eastAsia="Times New Roman"/>
-                <w:b w:val="0"/>
                 <w:sz w:val="18"/>
               </w:rPr>
               <w:t>6</w:t>
@@ -3133,24 +3151,21 @@
         </w:tc>
         <w:tc>
           <w:tcPr>
-            <w:tcW w:type="dxa" w:w="2494"/>
-            <w:vAlign w:val="center"/>
+            <w:tcW w:w="2494" w:type="dxa"/>
             <w:tcMar>
               <w:top w:w="90" w:type="dxa"/>
-              <w:start w:w="110" w:type="dxa"/>
+              <w:left w:w="110" w:type="dxa"/>
               <w:bottom w:w="90" w:type="dxa"/>
-              <w:end w:w="110" w:type="dxa"/>
+              <w:right w:w="110" w:type="dxa"/>
             </w:tcMar>
+            <w:vAlign w:val="center"/>
           </w:tcPr>
           <w:p>
             <w:pPr>
-              <w:spacing w:before="0" w:after="0" w:line="252" w:lineRule="auto"/>
-              <w:jc w:val="left"/>
+              <w:spacing w:after="0" w:line="252" w:lineRule="auto"/>
             </w:pPr>
-            <w:r/>
             <w:r>
               <w:rPr>
-                <w:rFonts w:ascii="Times New Roman" w:hAnsi="Times New Roman" w:eastAsia="Times New Roman"/>
                 <w:b/>
                 <w:sz w:val="18"/>
               </w:rPr>
@@ -3160,25 +3175,21 @@
         </w:tc>
         <w:tc>
           <w:tcPr>
-            <w:tcW w:type="dxa" w:w="6406"/>
-            <w:vAlign w:val="center"/>
+            <w:tcW w:w="6406" w:type="dxa"/>
             <w:tcMar>
               <w:top w:w="90" w:type="dxa"/>
-              <w:start w:w="110" w:type="dxa"/>
+              <w:left w:w="110" w:type="dxa"/>
               <w:bottom w:w="90" w:type="dxa"/>
-              <w:end w:w="110" w:type="dxa"/>
+              <w:right w:w="110" w:type="dxa"/>
             </w:tcMar>
+            <w:vAlign w:val="center"/>
           </w:tcPr>
           <w:p>
             <w:pPr>
-              <w:spacing w:before="0" w:after="0" w:line="252" w:lineRule="auto"/>
-              <w:jc w:val="left"/>
+              <w:spacing w:after="0" w:line="252" w:lineRule="auto"/>
             </w:pPr>
-            <w:r/>
             <w:r>
               <w:rPr>
-                <w:rFonts w:ascii="Times New Roman" w:hAnsi="Times New Roman" w:eastAsia="Times New Roman"/>
-                <w:b w:val="0"/>
                 <w:sz w:val="18"/>
               </w:rPr>
               <w:t>Danh sách, tìm kiếm và lọc dự án theo trạng thái kinh doanh, khu vực, loại hình, phân khúc, khoảng giá và diện tích; tạo, cập nhật, ẩn và đánh dấu dự án nổi bật theo quyền. Người dùng chỉ thấy dự án được phép truy cập.</w:t>
@@ -3189,28 +3200,26 @@
       <w:tr>
         <w:trPr>
           <w:cantSplit/>
+          <w:jc w:val="center"/>
         </w:trPr>
         <w:tc>
           <w:tcPr>
-            <w:tcW w:type="dxa" w:w="624"/>
-            <w:vAlign w:val="center"/>
+            <w:tcW w:w="624" w:type="dxa"/>
             <w:tcMar>
               <w:top w:w="90" w:type="dxa"/>
-              <w:start w:w="110" w:type="dxa"/>
+              <w:left w:w="110" w:type="dxa"/>
               <w:bottom w:w="90" w:type="dxa"/>
-              <w:end w:w="110" w:type="dxa"/>
+              <w:right w:w="110" w:type="dxa"/>
             </w:tcMar>
+            <w:vAlign w:val="center"/>
           </w:tcPr>
           <w:p>
             <w:pPr>
-              <w:spacing w:before="0" w:after="0" w:line="252" w:lineRule="auto"/>
+              <w:spacing w:after="0" w:line="252" w:lineRule="auto"/>
               <w:jc w:val="center"/>
             </w:pPr>
-            <w:r/>
             <w:r>
               <w:rPr>
-                <w:rFonts w:ascii="Times New Roman" w:hAnsi="Times New Roman" w:eastAsia="Times New Roman"/>
-                <w:b w:val="0"/>
                 <w:sz w:val="18"/>
               </w:rPr>
               <w:t>7</w:t>
@@ -3219,24 +3228,21 @@
         </w:tc>
         <w:tc>
           <w:tcPr>
-            <w:tcW w:type="dxa" w:w="2494"/>
-            <w:vAlign w:val="center"/>
+            <w:tcW w:w="2494" w:type="dxa"/>
             <w:tcMar>
               <w:top w:w="90" w:type="dxa"/>
-              <w:start w:w="110" w:type="dxa"/>
+              <w:left w:w="110" w:type="dxa"/>
               <w:bottom w:w="90" w:type="dxa"/>
-              <w:end w:w="110" w:type="dxa"/>
+              <w:right w:w="110" w:type="dxa"/>
             </w:tcMar>
+            <w:vAlign w:val="center"/>
           </w:tcPr>
           <w:p>
             <w:pPr>
-              <w:spacing w:before="0" w:after="0" w:line="252" w:lineRule="auto"/>
-              <w:jc w:val="left"/>
+              <w:spacing w:after="0" w:line="252" w:lineRule="auto"/>
             </w:pPr>
-            <w:r/>
             <w:r>
               <w:rPr>
-                <w:rFonts w:ascii="Times New Roman" w:hAnsi="Times New Roman" w:eastAsia="Times New Roman"/>
                 <w:b/>
                 <w:sz w:val="18"/>
               </w:rPr>
@@ -3246,25 +3252,21 @@
         </w:tc>
         <w:tc>
           <w:tcPr>
-            <w:tcW w:type="dxa" w:w="6406"/>
-            <w:vAlign w:val="center"/>
+            <w:tcW w:w="6406" w:type="dxa"/>
             <w:tcMar>
               <w:top w:w="90" w:type="dxa"/>
-              <w:start w:w="110" w:type="dxa"/>
+              <w:left w:w="110" w:type="dxa"/>
               <w:bottom w:w="90" w:type="dxa"/>
-              <w:end w:w="110" w:type="dxa"/>
+              <w:right w:w="110" w:type="dxa"/>
             </w:tcMar>
+            <w:vAlign w:val="center"/>
           </w:tcPr>
           <w:p>
             <w:pPr>
-              <w:spacing w:before="0" w:after="0" w:line="252" w:lineRule="auto"/>
-              <w:jc w:val="left"/>
+              <w:spacing w:after="0" w:line="252" w:lineRule="auto"/>
             </w:pPr>
-            <w:r/>
             <w:r>
               <w:rPr>
-                <w:rFonts w:ascii="Times New Roman" w:hAnsi="Times New Roman" w:eastAsia="Times New Roman"/>
-                <w:b w:val="0"/>
                 <w:sz w:val="18"/>
               </w:rPr>
               <w:t>Trang chi tiết dự án gồm các khối trong bản mô phỏng Giai đoạn 1: tổng quan, vị trí và liên kết vùng, tiện ích và điểm chính, mặt bằng, Sản phẩm Hot, Bài đăng, tài liệu nguồn, ảnh và tài liệu bán hàng. Cho phép người có quyền cập nhật từng khối và gắn nhãn công khai hoặc nội bộ.</w:t>
@@ -3275,28 +3277,26 @@
       <w:tr>
         <w:trPr>
           <w:cantSplit/>
+          <w:jc w:val="center"/>
         </w:trPr>
         <w:tc>
           <w:tcPr>
-            <w:tcW w:type="dxa" w:w="624"/>
-            <w:vAlign w:val="center"/>
+            <w:tcW w:w="624" w:type="dxa"/>
             <w:tcMar>
               <w:top w:w="90" w:type="dxa"/>
-              <w:start w:w="110" w:type="dxa"/>
+              <w:left w:w="110" w:type="dxa"/>
               <w:bottom w:w="90" w:type="dxa"/>
-              <w:end w:w="110" w:type="dxa"/>
+              <w:right w:w="110" w:type="dxa"/>
             </w:tcMar>
+            <w:vAlign w:val="center"/>
           </w:tcPr>
           <w:p>
             <w:pPr>
-              <w:spacing w:before="0" w:after="0" w:line="252" w:lineRule="auto"/>
+              <w:spacing w:after="0" w:line="252" w:lineRule="auto"/>
               <w:jc w:val="center"/>
             </w:pPr>
-            <w:r/>
             <w:r>
               <w:rPr>
-                <w:rFonts w:ascii="Times New Roman" w:hAnsi="Times New Roman" w:eastAsia="Times New Roman"/>
-                <w:b w:val="0"/>
                 <w:sz w:val="18"/>
               </w:rPr>
               <w:t>8</w:t>
@@ -3305,24 +3305,21 @@
         </w:tc>
         <w:tc>
           <w:tcPr>
-            <w:tcW w:type="dxa" w:w="2494"/>
-            <w:vAlign w:val="center"/>
+            <w:tcW w:w="2494" w:type="dxa"/>
             <w:tcMar>
               <w:top w:w="90" w:type="dxa"/>
-              <w:start w:w="110" w:type="dxa"/>
+              <w:left w:w="110" w:type="dxa"/>
               <w:bottom w:w="90" w:type="dxa"/>
-              <w:end w:w="110" w:type="dxa"/>
+              <w:right w:w="110" w:type="dxa"/>
             </w:tcMar>
+            <w:vAlign w:val="center"/>
           </w:tcPr>
           <w:p>
             <w:pPr>
-              <w:spacing w:before="0" w:after="0" w:line="252" w:lineRule="auto"/>
-              <w:jc w:val="left"/>
+              <w:spacing w:after="0" w:line="252" w:lineRule="auto"/>
             </w:pPr>
-            <w:r/>
             <w:r>
               <w:rPr>
-                <w:rFonts w:ascii="Times New Roman" w:hAnsi="Times New Roman" w:eastAsia="Times New Roman"/>
                 <w:b/>
                 <w:sz w:val="18"/>
               </w:rPr>
@@ -3332,25 +3329,21 @@
         </w:tc>
         <w:tc>
           <w:tcPr>
-            <w:tcW w:type="dxa" w:w="6406"/>
-            <w:vAlign w:val="center"/>
+            <w:tcW w:w="6406" w:type="dxa"/>
             <w:tcMar>
               <w:top w:w="90" w:type="dxa"/>
-              <w:start w:w="110" w:type="dxa"/>
+              <w:left w:w="110" w:type="dxa"/>
               <w:bottom w:w="90" w:type="dxa"/>
-              <w:end w:w="110" w:type="dxa"/>
+              <w:right w:w="110" w:type="dxa"/>
             </w:tcMar>
+            <w:vAlign w:val="center"/>
           </w:tcPr>
           <w:p>
             <w:pPr>
-              <w:spacing w:before="0" w:after="0" w:line="252" w:lineRule="auto"/>
-              <w:jc w:val="left"/>
+              <w:spacing w:after="0" w:line="252" w:lineRule="auto"/>
             </w:pPr>
-            <w:r/>
             <w:r>
               <w:rPr>
-                <w:rFonts w:ascii="Times New Roman" w:hAnsi="Times New Roman" w:eastAsia="Times New Roman"/>
-                <w:b w:val="0"/>
                 <w:sz w:val="18"/>
               </w:rPr>
               <w:t>Quản lý cây phân khu, khối hoặc tòa, tầng và căn hoặc lô; thêm và cập nhật sản phẩm, diện tích, loại hình, số phòng ngủ và tình trạng. Catalog cho phép tìm theo mã và lọc theo dự án, loại hình, số phòng ngủ, tình trạng; có trang chi tiết và so sánh cơ bản. Không hiển thị hoặc tính giá.</w:t>
@@ -3361,28 +3354,26 @@
       <w:tr>
         <w:trPr>
           <w:cantSplit/>
+          <w:jc w:val="center"/>
         </w:trPr>
         <w:tc>
           <w:tcPr>
-            <w:tcW w:type="dxa" w:w="624"/>
-            <w:vAlign w:val="center"/>
+            <w:tcW w:w="624" w:type="dxa"/>
             <w:tcMar>
               <w:top w:w="90" w:type="dxa"/>
-              <w:start w:w="110" w:type="dxa"/>
+              <w:left w:w="110" w:type="dxa"/>
               <w:bottom w:w="90" w:type="dxa"/>
-              <w:end w:w="110" w:type="dxa"/>
+              <w:right w:w="110" w:type="dxa"/>
             </w:tcMar>
+            <w:vAlign w:val="center"/>
           </w:tcPr>
           <w:p>
             <w:pPr>
-              <w:spacing w:before="0" w:after="0" w:line="252" w:lineRule="auto"/>
+              <w:spacing w:after="0" w:line="252" w:lineRule="auto"/>
               <w:jc w:val="center"/>
             </w:pPr>
-            <w:r/>
             <w:r>
               <w:rPr>
-                <w:rFonts w:ascii="Times New Roman" w:hAnsi="Times New Roman" w:eastAsia="Times New Roman"/>
-                <w:b w:val="0"/>
                 <w:sz w:val="18"/>
               </w:rPr>
               <w:t>9</w:t>
@@ -3391,24 +3382,21 @@
         </w:tc>
         <w:tc>
           <w:tcPr>
-            <w:tcW w:type="dxa" w:w="2494"/>
-            <w:vAlign w:val="center"/>
+            <w:tcW w:w="2494" w:type="dxa"/>
             <w:tcMar>
               <w:top w:w="90" w:type="dxa"/>
-              <w:start w:w="110" w:type="dxa"/>
+              <w:left w:w="110" w:type="dxa"/>
               <w:bottom w:w="90" w:type="dxa"/>
-              <w:end w:w="110" w:type="dxa"/>
+              <w:right w:w="110" w:type="dxa"/>
             </w:tcMar>
+            <w:vAlign w:val="center"/>
           </w:tcPr>
           <w:p>
             <w:pPr>
-              <w:spacing w:before="0" w:after="0" w:line="252" w:lineRule="auto"/>
-              <w:jc w:val="left"/>
+              <w:spacing w:after="0" w:line="252" w:lineRule="auto"/>
             </w:pPr>
-            <w:r/>
             <w:r>
               <w:rPr>
-                <w:rFonts w:ascii="Times New Roman" w:hAnsi="Times New Roman" w:eastAsia="Times New Roman"/>
                 <w:b/>
                 <w:sz w:val="18"/>
               </w:rPr>
@@ -3418,25 +3406,21 @@
         </w:tc>
         <w:tc>
           <w:tcPr>
-            <w:tcW w:type="dxa" w:w="6406"/>
-            <w:vAlign w:val="center"/>
+            <w:tcW w:w="6406" w:type="dxa"/>
             <w:tcMar>
               <w:top w:w="90" w:type="dxa"/>
-              <w:start w:w="110" w:type="dxa"/>
+              <w:left w:w="110" w:type="dxa"/>
               <w:bottom w:w="90" w:type="dxa"/>
-              <w:end w:w="110" w:type="dxa"/>
+              <w:right w:w="110" w:type="dxa"/>
             </w:tcMar>
+            <w:vAlign w:val="center"/>
           </w:tcPr>
           <w:p>
             <w:pPr>
-              <w:spacing w:before="0" w:after="0" w:line="252" w:lineRule="auto"/>
-              <w:jc w:val="left"/>
+              <w:spacing w:after="0" w:line="252" w:lineRule="auto"/>
             </w:pPr>
-            <w:r/>
             <w:r>
               <w:rPr>
-                <w:rFonts w:ascii="Times New Roman" w:hAnsi="Times New Roman" w:eastAsia="Times New Roman"/>
-                <w:b w:val="0"/>
                 <w:sz w:val="18"/>
               </w:rPr>
               <w:t>Người quản lý có quyền đánh dấu hoặc gỡ Sản phẩm Hot và nhập đoạn giới thiệu ngắn; hiển thị dạng danh sách trượt tại Trang đầu và trang dự án. Nhân viên bán hàng chỉ khai thác nội dung đã được duyệt, không tự gắn Hot.</w:t>
@@ -3447,28 +3431,26 @@
       <w:tr>
         <w:trPr>
           <w:cantSplit/>
+          <w:jc w:val="center"/>
         </w:trPr>
         <w:tc>
           <w:tcPr>
-            <w:tcW w:type="dxa" w:w="624"/>
-            <w:vAlign w:val="center"/>
+            <w:tcW w:w="624" w:type="dxa"/>
             <w:tcMar>
               <w:top w:w="90" w:type="dxa"/>
-              <w:start w:w="110" w:type="dxa"/>
+              <w:left w:w="110" w:type="dxa"/>
               <w:bottom w:w="90" w:type="dxa"/>
-              <w:end w:w="110" w:type="dxa"/>
+              <w:right w:w="110" w:type="dxa"/>
             </w:tcMar>
+            <w:vAlign w:val="center"/>
           </w:tcPr>
           <w:p>
             <w:pPr>
-              <w:spacing w:before="0" w:after="0" w:line="252" w:lineRule="auto"/>
+              <w:spacing w:after="0" w:line="252" w:lineRule="auto"/>
               <w:jc w:val="center"/>
             </w:pPr>
-            <w:r/>
             <w:r>
               <w:rPr>
-                <w:rFonts w:ascii="Times New Roman" w:hAnsi="Times New Roman" w:eastAsia="Times New Roman"/>
-                <w:b w:val="0"/>
                 <w:sz w:val="18"/>
               </w:rPr>
               <w:t>10</w:t>
@@ -3477,24 +3459,21 @@
         </w:tc>
         <w:tc>
           <w:tcPr>
-            <w:tcW w:type="dxa" w:w="2494"/>
-            <w:vAlign w:val="center"/>
+            <w:tcW w:w="2494" w:type="dxa"/>
             <w:tcMar>
               <w:top w:w="90" w:type="dxa"/>
-              <w:start w:w="110" w:type="dxa"/>
+              <w:left w:w="110" w:type="dxa"/>
               <w:bottom w:w="90" w:type="dxa"/>
-              <w:end w:w="110" w:type="dxa"/>
+              <w:right w:w="110" w:type="dxa"/>
             </w:tcMar>
+            <w:vAlign w:val="center"/>
           </w:tcPr>
           <w:p>
             <w:pPr>
-              <w:spacing w:before="0" w:after="0" w:line="252" w:lineRule="auto"/>
-              <w:jc w:val="left"/>
+              <w:spacing w:after="0" w:line="252" w:lineRule="auto"/>
             </w:pPr>
-            <w:r/>
             <w:r>
               <w:rPr>
-                <w:rFonts w:ascii="Times New Roman" w:hAnsi="Times New Roman" w:eastAsia="Times New Roman"/>
                 <w:b/>
                 <w:sz w:val="18"/>
               </w:rPr>
@@ -3504,25 +3483,21 @@
         </w:tc>
         <w:tc>
           <w:tcPr>
-            <w:tcW w:type="dxa" w:w="6406"/>
-            <w:vAlign w:val="center"/>
+            <w:tcW w:w="6406" w:type="dxa"/>
             <w:tcMar>
               <w:top w:w="90" w:type="dxa"/>
-              <w:start w:w="110" w:type="dxa"/>
+              <w:left w:w="110" w:type="dxa"/>
               <w:bottom w:w="90" w:type="dxa"/>
-              <w:end w:w="110" w:type="dxa"/>
+              <w:right w:w="110" w:type="dxa"/>
             </w:tcMar>
+            <w:vAlign w:val="center"/>
           </w:tcPr>
           <w:p>
             <w:pPr>
-              <w:spacing w:before="0" w:after="0" w:line="252" w:lineRule="auto"/>
-              <w:jc w:val="left"/>
+              <w:spacing w:after="0" w:line="252" w:lineRule="auto"/>
             </w:pPr>
-            <w:r/>
             <w:r>
               <w:rPr>
-                <w:rFonts w:ascii="Times New Roman" w:hAnsi="Times New Roman" w:eastAsia="Times New Roman"/>
-                <w:b w:val="0"/>
                 <w:sz w:val="18"/>
               </w:rPr>
               <w:t>Cây tài liệu theo dự án với bảy nhánh nghiệp vụ và thư mục con; tải tệp hoặc lưu thẻ liên kết nguồn Google Drive; tìm kiếm và lọc theo dự án, loại, nguồn, trạng thái, nhãn quyền và hiệu lực. Có xem trước, tải bản có dấu nhận diện, mở nguồn, cảnh báo sắp hết hiệu lực, liên kết hỏng, gia hạn và duyệt theo quyền. Hệ thống không tự đồng bộ hoặc sao chép dữ liệu từ Google Drive.</w:t>
@@ -3533,54 +3508,50 @@
       <w:tr>
         <w:trPr>
           <w:cantSplit/>
+          <w:jc w:val="center"/>
         </w:trPr>
         <w:tc>
           <w:tcPr>
-            <w:tcW w:type="dxa" w:w="624"/>
-            <w:vAlign w:val="center"/>
+            <w:tcW w:w="624" w:type="dxa"/>
             <w:tcMar>
               <w:top w:w="90" w:type="dxa"/>
-              <w:start w:w="110" w:type="dxa"/>
+              <w:left w:w="110" w:type="dxa"/>
               <w:bottom w:w="90" w:type="dxa"/>
-              <w:end w:w="110" w:type="dxa"/>
+              <w:right w:w="110" w:type="dxa"/>
             </w:tcMar>
+            <w:vAlign w:val="center"/>
           </w:tcPr>
           <w:p>
             <w:pPr>
-              <w:spacing w:before="0" w:after="0" w:line="252" w:lineRule="auto"/>
+              <w:spacing w:after="0" w:line="252" w:lineRule="auto"/>
               <w:jc w:val="center"/>
             </w:pPr>
-            <w:r/>
             <w:r>
               <w:rPr>
-                <w:rFonts w:ascii="Times New Roman" w:hAnsi="Times New Roman" w:eastAsia="Times New Roman"/>
-                <w:b w:val="0"/>
                 <w:sz w:val="18"/>
               </w:rPr>
+              <w:lastRenderedPageBreak/>
               <w:t>11</w:t>
             </w:r>
           </w:p>
         </w:tc>
         <w:tc>
           <w:tcPr>
-            <w:tcW w:type="dxa" w:w="2494"/>
-            <w:vAlign w:val="center"/>
+            <w:tcW w:w="2494" w:type="dxa"/>
             <w:tcMar>
               <w:top w:w="90" w:type="dxa"/>
-              <w:start w:w="110" w:type="dxa"/>
+              <w:left w:w="110" w:type="dxa"/>
               <w:bottom w:w="90" w:type="dxa"/>
-              <w:end w:w="110" w:type="dxa"/>
+              <w:right w:w="110" w:type="dxa"/>
             </w:tcMar>
+            <w:vAlign w:val="center"/>
           </w:tcPr>
           <w:p>
             <w:pPr>
-              <w:spacing w:before="0" w:after="0" w:line="252" w:lineRule="auto"/>
-              <w:jc w:val="left"/>
+              <w:spacing w:after="0" w:line="252" w:lineRule="auto"/>
             </w:pPr>
-            <w:r/>
             <w:r>
               <w:rPr>
-                <w:rFonts w:ascii="Times New Roman" w:hAnsi="Times New Roman" w:eastAsia="Times New Roman"/>
                 <w:b/>
                 <w:sz w:val="18"/>
               </w:rPr>
@@ -3590,25 +3561,21 @@
         </w:tc>
         <w:tc>
           <w:tcPr>
-            <w:tcW w:type="dxa" w:w="6406"/>
-            <w:vAlign w:val="center"/>
+            <w:tcW w:w="6406" w:type="dxa"/>
             <w:tcMar>
               <w:top w:w="90" w:type="dxa"/>
-              <w:start w:w="110" w:type="dxa"/>
+              <w:left w:w="110" w:type="dxa"/>
               <w:bottom w:w="90" w:type="dxa"/>
-              <w:end w:w="110" w:type="dxa"/>
+              <w:right w:w="110" w:type="dxa"/>
             </w:tcMar>
+            <w:vAlign w:val="center"/>
           </w:tcPr>
           <w:p>
             <w:pPr>
-              <w:spacing w:before="0" w:after="0" w:line="252" w:lineRule="auto"/>
-              <w:jc w:val="left"/>
+              <w:spacing w:after="0" w:line="252" w:lineRule="auto"/>
             </w:pPr>
-            <w:r/>
             <w:r>
               <w:rPr>
-                <w:rFonts w:ascii="Times New Roman" w:hAnsi="Times New Roman" w:eastAsia="Times New Roman"/>
-                <w:b w:val="0"/>
                 <w:sz w:val="18"/>
               </w:rPr>
               <w:t>Ba khu vực Mẫu chung, Mẫu của tôi và Đã gửi; tạo, sửa, tìm kiếm và lọc theo dự án, sản phẩm, loại mẫu, người tạo và trạng thái. Mẫu chung phải được người có quyền duyệt; mẫu cá nhân chỉ chủ sở hữu xem và có thể đề xuất nâng thành mẫu chung.</w:t>
@@ -3619,28 +3586,26 @@
       <w:tr>
         <w:trPr>
           <w:cantSplit/>
+          <w:jc w:val="center"/>
         </w:trPr>
         <w:tc>
           <w:tcPr>
-            <w:tcW w:type="dxa" w:w="624"/>
-            <w:vAlign w:val="center"/>
+            <w:tcW w:w="624" w:type="dxa"/>
             <w:tcMar>
               <w:top w:w="90" w:type="dxa"/>
-              <w:start w:w="110" w:type="dxa"/>
+              <w:left w:w="110" w:type="dxa"/>
               <w:bottom w:w="90" w:type="dxa"/>
-              <w:end w:w="110" w:type="dxa"/>
+              <w:right w:w="110" w:type="dxa"/>
             </w:tcMar>
+            <w:vAlign w:val="center"/>
           </w:tcPr>
           <w:p>
             <w:pPr>
-              <w:spacing w:before="0" w:after="0" w:line="252" w:lineRule="auto"/>
+              <w:spacing w:after="0" w:line="252" w:lineRule="auto"/>
               <w:jc w:val="center"/>
             </w:pPr>
-            <w:r/>
             <w:r>
               <w:rPr>
-                <w:rFonts w:ascii="Times New Roman" w:hAnsi="Times New Roman" w:eastAsia="Times New Roman"/>
-                <w:b w:val="0"/>
                 <w:sz w:val="18"/>
               </w:rPr>
               <w:t>12</w:t>
@@ -3649,24 +3614,21 @@
         </w:tc>
         <w:tc>
           <w:tcPr>
-            <w:tcW w:type="dxa" w:w="2494"/>
-            <w:vAlign w:val="center"/>
+            <w:tcW w:w="2494" w:type="dxa"/>
             <w:tcMar>
               <w:top w:w="90" w:type="dxa"/>
-              <w:start w:w="110" w:type="dxa"/>
+              <w:left w:w="110" w:type="dxa"/>
               <w:bottom w:w="90" w:type="dxa"/>
-              <w:end w:w="110" w:type="dxa"/>
+              <w:right w:w="110" w:type="dxa"/>
             </w:tcMar>
+            <w:vAlign w:val="center"/>
           </w:tcPr>
           <w:p>
             <w:pPr>
-              <w:spacing w:before="0" w:after="0" w:line="252" w:lineRule="auto"/>
-              <w:jc w:val="left"/>
+              <w:spacing w:after="0" w:line="252" w:lineRule="auto"/>
             </w:pPr>
-            <w:r/>
             <w:r>
               <w:rPr>
-                <w:rFonts w:ascii="Times New Roman" w:hAnsi="Times New Roman" w:eastAsia="Times New Roman"/>
                 <w:b/>
                 <w:sz w:val="18"/>
               </w:rPr>
@@ -3676,25 +3638,21 @@
         </w:tc>
         <w:tc>
           <w:tcPr>
-            <w:tcW w:type="dxa" w:w="6406"/>
-            <w:vAlign w:val="center"/>
+            <w:tcW w:w="6406" w:type="dxa"/>
             <w:tcMar>
               <w:top w:w="90" w:type="dxa"/>
-              <w:start w:w="110" w:type="dxa"/>
+              <w:left w:w="110" w:type="dxa"/>
               <w:bottom w:w="90" w:type="dxa"/>
-              <w:end w:w="110" w:type="dxa"/>
+              <w:right w:w="110" w:type="dxa"/>
             </w:tcMar>
+            <w:vAlign w:val="center"/>
           </w:tcPr>
           <w:p>
             <w:pPr>
-              <w:spacing w:before="0" w:after="0" w:line="252" w:lineRule="auto"/>
-              <w:jc w:val="left"/>
+              <w:spacing w:after="0" w:line="252" w:lineRule="auto"/>
             </w:pPr>
-            <w:r/>
             <w:r>
               <w:rPr>
-                <w:rFonts w:ascii="Times New Roman" w:hAnsi="Times New Roman" w:eastAsia="Times New Roman"/>
-                <w:b w:val="0"/>
                 <w:sz w:val="18"/>
               </w:rPr>
               <w:t>Chọn các khối nội dung công khai và tối đa một Sản phẩm Hot, sắp xếp và xem trước bài; sao chép nội dung hoặc tạo đường dẫn trang gửi khách. Hệ thống mở các kênh Zalo, Facebook, Batdongsan, Muaban, Homedy, Chợ Tốt và Alonhadat để người dùng dán thủ công; không tự điền biểu mẫu hoặc tự đăng. Trang gửi khách hiển thị đúng nội dung đã chọn và thông tin người phụ trách; đường dẫn có hạn và có thể bị vô hiệu hóa.</w:t>
@@ -3705,28 +3663,26 @@
       <w:tr>
         <w:trPr>
           <w:cantSplit/>
+          <w:jc w:val="center"/>
         </w:trPr>
         <w:tc>
           <w:tcPr>
-            <w:tcW w:type="dxa" w:w="624"/>
-            <w:vAlign w:val="center"/>
+            <w:tcW w:w="624" w:type="dxa"/>
             <w:tcMar>
               <w:top w:w="90" w:type="dxa"/>
-              <w:start w:w="110" w:type="dxa"/>
+              <w:left w:w="110" w:type="dxa"/>
               <w:bottom w:w="90" w:type="dxa"/>
-              <w:end w:w="110" w:type="dxa"/>
+              <w:right w:w="110" w:type="dxa"/>
             </w:tcMar>
+            <w:vAlign w:val="center"/>
           </w:tcPr>
           <w:p>
             <w:pPr>
-              <w:spacing w:before="0" w:after="0" w:line="252" w:lineRule="auto"/>
+              <w:spacing w:after="0" w:line="252" w:lineRule="auto"/>
               <w:jc w:val="center"/>
             </w:pPr>
-            <w:r/>
             <w:r>
               <w:rPr>
-                <w:rFonts w:ascii="Times New Roman" w:hAnsi="Times New Roman" w:eastAsia="Times New Roman"/>
-                <w:b w:val="0"/>
                 <w:sz w:val="18"/>
               </w:rPr>
               <w:t>13</w:t>
@@ -3735,24 +3691,21 @@
         </w:tc>
         <w:tc>
           <w:tcPr>
-            <w:tcW w:type="dxa" w:w="2494"/>
-            <w:vAlign w:val="center"/>
+            <w:tcW w:w="2494" w:type="dxa"/>
             <w:tcMar>
               <w:top w:w="90" w:type="dxa"/>
-              <w:start w:w="110" w:type="dxa"/>
+              <w:left w:w="110" w:type="dxa"/>
               <w:bottom w:w="90" w:type="dxa"/>
-              <w:end w:w="110" w:type="dxa"/>
+              <w:right w:w="110" w:type="dxa"/>
             </w:tcMar>
+            <w:vAlign w:val="center"/>
           </w:tcPr>
           <w:p>
             <w:pPr>
-              <w:spacing w:before="0" w:after="0" w:line="252" w:lineRule="auto"/>
-              <w:jc w:val="left"/>
+              <w:spacing w:after="0" w:line="252" w:lineRule="auto"/>
             </w:pPr>
-            <w:r/>
             <w:r>
               <w:rPr>
-                <w:rFonts w:ascii="Times New Roman" w:hAnsi="Times New Roman" w:eastAsia="Times New Roman"/>
                 <w:b/>
                 <w:sz w:val="18"/>
               </w:rPr>
@@ -3762,25 +3715,21 @@
         </w:tc>
         <w:tc>
           <w:tcPr>
-            <w:tcW w:type="dxa" w:w="6406"/>
-            <w:vAlign w:val="center"/>
+            <w:tcW w:w="6406" w:type="dxa"/>
             <w:tcMar>
               <w:top w:w="90" w:type="dxa"/>
-              <w:start w:w="110" w:type="dxa"/>
+              <w:left w:w="110" w:type="dxa"/>
               <w:bottom w:w="90" w:type="dxa"/>
-              <w:end w:w="110" w:type="dxa"/>
+              <w:right w:w="110" w:type="dxa"/>
             </w:tcMar>
+            <w:vAlign w:val="center"/>
           </w:tcPr>
           <w:p>
             <w:pPr>
-              <w:spacing w:before="0" w:after="0" w:line="252" w:lineRule="auto"/>
-              <w:jc w:val="left"/>
+              <w:spacing w:after="0" w:line="252" w:lineRule="auto"/>
             </w:pPr>
-            <w:r/>
             <w:r>
               <w:rPr>
-                <w:rFonts w:ascii="Times New Roman" w:hAnsi="Times New Roman" w:eastAsia="Times New Roman"/>
-                <w:b w:val="0"/>
                 <w:sz w:val="18"/>
               </w:rPr>
               <w:t>Màn quản trị dự án, sản phẩm, Sản phẩm Hot, tài liệu, nhãn quyền, ngày hiệu lực và hàng chờ duyệt; duyệt, trả lại kèm lý do và theo dõi trạng thái. Người dùng có thể gửi đề nghị sửa nội dung; người phụ trách tiếp nhận, cập nhật và phản hồi trên hệ thống.</w:t>
@@ -3791,28 +3740,26 @@
       <w:tr>
         <w:trPr>
           <w:cantSplit/>
+          <w:jc w:val="center"/>
         </w:trPr>
         <w:tc>
           <w:tcPr>
-            <w:tcW w:type="dxa" w:w="624"/>
-            <w:vAlign w:val="center"/>
+            <w:tcW w:w="624" w:type="dxa"/>
             <w:tcMar>
               <w:top w:w="90" w:type="dxa"/>
-              <w:start w:w="110" w:type="dxa"/>
+              <w:left w:w="110" w:type="dxa"/>
               <w:bottom w:w="90" w:type="dxa"/>
-              <w:end w:w="110" w:type="dxa"/>
+              <w:right w:w="110" w:type="dxa"/>
             </w:tcMar>
+            <w:vAlign w:val="center"/>
           </w:tcPr>
           <w:p>
             <w:pPr>
-              <w:spacing w:before="0" w:after="0" w:line="252" w:lineRule="auto"/>
+              <w:spacing w:after="0" w:line="252" w:lineRule="auto"/>
               <w:jc w:val="center"/>
             </w:pPr>
-            <w:r/>
             <w:r>
               <w:rPr>
-                <w:rFonts w:ascii="Times New Roman" w:hAnsi="Times New Roman" w:eastAsia="Times New Roman"/>
-                <w:b w:val="0"/>
                 <w:sz w:val="18"/>
               </w:rPr>
               <w:t>14</w:t>
@@ -3821,24 +3768,21 @@
         </w:tc>
         <w:tc>
           <w:tcPr>
-            <w:tcW w:type="dxa" w:w="2494"/>
-            <w:vAlign w:val="center"/>
+            <w:tcW w:w="2494" w:type="dxa"/>
             <w:tcMar>
               <w:top w:w="90" w:type="dxa"/>
-              <w:start w:w="110" w:type="dxa"/>
+              <w:left w:w="110" w:type="dxa"/>
               <w:bottom w:w="90" w:type="dxa"/>
-              <w:end w:w="110" w:type="dxa"/>
+              <w:right w:w="110" w:type="dxa"/>
             </w:tcMar>
+            <w:vAlign w:val="center"/>
           </w:tcPr>
           <w:p>
             <w:pPr>
-              <w:spacing w:before="0" w:after="0" w:line="252" w:lineRule="auto"/>
-              <w:jc w:val="left"/>
+              <w:spacing w:after="0" w:line="252" w:lineRule="auto"/>
             </w:pPr>
-            <w:r/>
             <w:r>
               <w:rPr>
-                <w:rFonts w:ascii="Times New Roman" w:hAnsi="Times New Roman" w:eastAsia="Times New Roman"/>
                 <w:b/>
                 <w:sz w:val="18"/>
               </w:rPr>
@@ -3848,25 +3792,21 @@
         </w:tc>
         <w:tc>
           <w:tcPr>
-            <w:tcW w:type="dxa" w:w="6406"/>
-            <w:vAlign w:val="center"/>
+            <w:tcW w:w="6406" w:type="dxa"/>
             <w:tcMar>
               <w:top w:w="90" w:type="dxa"/>
-              <w:start w:w="110" w:type="dxa"/>
+              <w:left w:w="110" w:type="dxa"/>
               <w:bottom w:w="90" w:type="dxa"/>
-              <w:end w:w="110" w:type="dxa"/>
+              <w:right w:w="110" w:type="dxa"/>
             </w:tcMar>
+            <w:vAlign w:val="center"/>
           </w:tcPr>
           <w:p>
             <w:pPr>
-              <w:spacing w:before="0" w:after="0" w:line="252" w:lineRule="auto"/>
-              <w:jc w:val="left"/>
+              <w:spacing w:after="0" w:line="252" w:lineRule="auto"/>
             </w:pPr>
-            <w:r/>
             <w:r>
               <w:rPr>
-                <w:rFonts w:ascii="Times New Roman" w:hAnsi="Times New Roman" w:eastAsia="Times New Roman"/>
-                <w:b w:val="0"/>
                 <w:sz w:val="18"/>
               </w:rPr>
               <w:t>Tìm kiếm trong phạm vi được cấp quyền; thông báo việc cần xử lý, nội dung được duyệt hoặc trả lại và tài liệu sắp hết hiệu lực. Bao gồm kiểm thử chức năng và phân quyền, cấu hình một bộ dữ liệu mẫu, sửa lỗi trước bàn giao, một buổi hướng dẫn sử dụng, tài liệu hướng dẫn ngắn gọn và phối hợp quản lý dự án trong 06 tuần.</w:t>
@@ -4147,7 +4087,6 @@
       </w:pPr>
       <w:r>
         <w:rPr>
-          <w:rFonts w:ascii="Times New Roman" w:hAnsi="Times New Roman" w:eastAsia="Times New Roman"/>
           <w:sz w:val="22"/>
         </w:rPr>
         <w:t>- Giai đoạn 1 không bao gồm: phiếu tính giá; lưới bảng hàng làm mô hình sản phẩm; hiển thị giá trong catalog; bộ hỏi đáp 88 câu; kịch bản bán hàng MH-12; mẫu riêng cho từng kênh, lịch đăng, tự điền biểu mẫu hoặc tự đăng lên kênh ngoài; biểu mẫu khách để lại thông tin và quản lý khách tiềm năng; tài khoản đăng nhập dành cho khách hàng; báo cáo vận hành chuyên sâu; tự đồng bộ hoặc nhập nội dung trực tiếp từ Google Drive; ứng dụng iOS/Android; CRM, giao dịch, doanh thu, hoa hồng, AI và các chức năng Giai đoạn 2.</w:t>
@@ -4186,6 +4125,7 @@
         <w:rPr>
           <w:rFonts w:ascii="Times New Roman" w:hAnsi="Times New Roman" w:cs="Times New Roman"/>
         </w:rPr>
+        <w:lastRenderedPageBreak/>
         <w:t>6. TIÊU CHÍ NGHIỆM THU</w:t>
       </w:r>
     </w:p>
@@ -4289,7 +4229,6 @@
                 <w:rFonts w:cs="Times New Roman"/>
                 <w:sz w:val="21"/>
               </w:rPr>
-              <w:lastRenderedPageBreak/>
               <w:t>Đúng phạm vi</w:t>
             </w:r>
           </w:p>
@@ -4742,8 +4681,7 @@
       </w:pPr>
     </w:p>
     <w:sectPr>
-      <w:headerReference w:type="default" r:id="rId8"/>
-      <w:footerReference w:type="default" r:id="rId9"/>
+      <w:footerReference w:type="default" r:id="rId8"/>
       <w:pgSz w:w="12240" w:h="15840"/>
       <w:pgMar w:top="935" w:right="992" w:bottom="879" w:left="1219" w:header="720" w:footer="720" w:gutter="0"/>
       <w:cols w:space="720"/>
@@ -4886,71 +4824,6 @@
     </w:p>
   </w:footnote>
 </w:footnotes>
-</file>
-
-<file path=word/header1.xml><?xml version="1.0" encoding="utf-8"?>
-<w:hdr xmlns:wpc="http://schemas.microsoft.com/office/word/2010/wordprocessingCanvas" xmlns:cx="http://schemas.microsoft.com/office/drawing/2014/chartex" xmlns:cx1="http://schemas.microsoft.com/office/drawing/2015/9/8/chartex" xmlns:cx2="http://schemas.microsoft.com/office/drawing/2015/10/21/chartex" xmlns:cx3="http://schemas.microsoft.com/office/drawing/2016/5/9/chartex" xmlns:cx4="http://schemas.microsoft.com/office/drawing/2016/5/10/chartex" xmlns:cx5="http://schemas.microsoft.com/office/drawing/2016/5/11/chartex" xmlns:cx6="http://schemas.microsoft.com/office/drawing/2016/5/12/chartex" xmlns:cx7="http://schemas.microsoft.com/office/drawing/2016/5/13/chartex" xmlns:cx8="http://schemas.microsoft.com/office/drawing/2016/5/14/chartex" xmlns:mc="http://schemas.openxmlformats.org/markup-compatibility/2006" xmlns:aink="http://schemas.microsoft.com/office/drawing/2016/ink" xmlns:am3d="http://schemas.microsoft.com/office/drawing/2017/model3d" xmlns:o="urn:schemas-microsoft-com:office:office" xmlns:oel="http://schemas.microsoft.com/office/2019/extlst" xmlns:r="http://schemas.openxmlformats.org/officeDocument/2006/relationships" xmlns:m="http://schemas.openxmlformats.org/officeDocument/2006/math" xmlns:v="urn:schemas-microsoft-com:vml" xmlns:wp14="http://schemas.microsoft.com/office/word/2010/wordprocessingDrawing" xmlns:wp="http://schemas.openxmlformats.org/drawingml/2006/wordprocessingDrawing" xmlns:w10="urn:schemas-microsoft-com:office:word" xmlns:w="http://schemas.openxmlformats.org/wordprocessingml/2006/main" xmlns:w14="http://schemas.microsoft.com/office/word/2010/wordml" xmlns:w15="http://schemas.microsoft.com/office/word/2012/wordml" xmlns:w16cex="http://schemas.microsoft.com/office/word/2018/wordml/cex" xmlns:w16cid="http://schemas.microsoft.com/office/word/2016/wordml/cid" xmlns:w16="http://schemas.microsoft.com/office/word/2018/wordml" xmlns:w16du="http://schemas.microsoft.com/office/word/2023/wordml/word16du" xmlns:w16sdtdh="http://schemas.microsoft.com/office/word/2020/wordml/sdtdatahash" xmlns:w16sdtfl="http://schemas.microsoft.com/office/word/2024/wordml/sdtformatlock" xmlns:w16se="http://schemas.microsoft.com/office/word/2015/wordml/symex" xmlns:wpg="http://schemas.microsoft.com/office/word/2010/wordprocessingGroup" xmlns:wpi="http://schemas.microsoft.com/office/word/2010/wordprocessingInk" xmlns:wne="http://schemas.microsoft.com/office/word/2006/wordml" xmlns:wps="http://schemas.microsoft.com/office/word/2010/wordprocessingShape" mc:Ignorable="w14 w15 w16se w16cid w16 w16cex w16sdtdh w16sdtfl w16du wp14">
-  <w:p>
-    <w:pPr>
-      <w:pStyle w:val="Header"/>
-    </w:pPr>
-  </w:p>
-  <w:tbl>
-    <w:tblPr>
-      <w:tblW w:w="0" w:type="auto"/>
-      <w:tblLayout w:type="fixed"/>
-      <w:tblLook w:val="04A0" w:firstRow="1" w:lastRow="0" w:firstColumn="1" w:lastColumn="0" w:noHBand="0" w:noVBand="1"/>
-    </w:tblPr>
-    <w:tblGrid>
-      <w:gridCol w:w="4620"/>
-      <w:gridCol w:w="4620"/>
-    </w:tblGrid>
-    <w:tr>
-      <w:tc>
-        <w:tcPr>
-          <w:tcW w:w="4620" w:type="dxa"/>
-        </w:tcPr>
-        <w:p>
-          <w:pPr>
-            <w:jc w:val="center"/>
-          </w:pPr>
-          <w:r>
-            <w:rPr>
-              <w:b/>
-              <w:sz w:val="20"/>
-            </w:rPr>
-            <w:t>CÔNG TY TNHH DỊCH VỤ GIẢI TRÍ TLB</w:t>
-          </w:r>
-        </w:p>
-      </w:tc>
-      <w:tc>
-        <w:tcPr>
-          <w:tcW w:w="4620" w:type="dxa"/>
-        </w:tcPr>
-        <w:p>
-          <w:pPr>
-            <w:jc w:val="center"/>
-          </w:pPr>
-          <w:r>
-            <w:rPr>
-              <w:b/>
-              <w:sz w:val="20"/>
-            </w:rPr>
-            <w:t>CỘNG HÒA XÃ HỘI CHỦ NGHĨA VIỆT NAM</w:t>
-          </w:r>
-          <w:r>
-            <w:rPr>
-              <w:b/>
-              <w:sz w:val="20"/>
-            </w:rPr>
-            <w:br/>
-            <w:t>Độc lập - Tự do - Hạnh phúc</w:t>
-          </w:r>
-        </w:p>
-      </w:tc>
-    </w:tr>
-  </w:tbl>
-</w:hdr>
 </file>
 
 <file path=word/numbering.xml><?xml version="1.0" encoding="utf-8"?>

</xml_diff>